<commit_message>
Update downloadable CV with portfolio and GitHub links
</commit_message>
<xml_diff>
--- a/assets/Abdulrahman_CV.docx
+++ b/assets/Abdulrahman_CV.docx
@@ -94,6 +94,27 @@
             <w:u w:val="single"/>
           </w:rPr>
           <w:t xml:space="preserve">GitHub</w:t>
+        </w:r>
+      </w:hyperlink>
+      <w:r>
+        <w:rPr>
+          <w:rFonts w:ascii="Calibri" w:cs="Calibri" w:eastAsia="Calibri" w:hAnsi="Calibri"/>
+          <w:color w:val="777777"/>
+          <w:sz w:val="18"/>
+          <w:szCs w:val="18"/>
+        </w:rPr>
+        <w:t xml:space="preserve">  |  </w:t>
+      </w:r>
+      <w:hyperlink w:history="1" r:id="rIdwebsitecv01">
+        <w:r>
+          <w:rPr>
+            <w:rFonts w:ascii="Calibri" w:cs="Calibri" w:eastAsia="Calibri" w:hAnsi="Calibri"/>
+            <w:color w:val="1A55A0"/>
+            <w:sz w:val="18"/>
+            <w:szCs w:val="18"/>
+            <w:u w:val="single"/>
+          </w:rPr>
+          <w:t xml:space="preserve">Portfolio</w:t>
         </w:r>
       </w:hyperlink>
       <w:r>

</xml_diff>